<commit_message>
Pip explains: 58 checked cards for Microbiology Exam 3 (Lecture 14)
pip/explain/microbiology-exam-3.json, written from the Exam 3 guide's sections by one writer,
then corrected by an independent fact-checker (27 of 55 drafts changed, 3 added), then a
second report-only check: 311 sentences, each with a verbatim guide quote machine-verified
in its own section (311/311); its 11 issues (invented cause-and-effect links, a lost
"minority of cases" hedge, an over-broad non-coliform list) and 8 keyword/question fixes are
applied. No drug-choice teaching, none of the disputed slide points. pip_explain.py check:
58 cards, 0 errors (the 14.21 notes section has no card on purpose).

Guide: a lead line in 14.14 names Salmonella typhi as the cause of typhoid fever (it was only
in the table header, which the card checkers' text does not carry).

Co-Authored-By: Claude Opus 5.5 <noreply@anthropic.com>
</commit_message>
<xml_diff>
--- a/Microbiology Exam 3/micro-exam-3-study-guide.docx
+++ b/Microbiology Exam 3/micro-exam-3-study-guide.docx
@@ -10608,6 +10608,53 @@
           <w:color w:val="1F4D2B"/>
         </w:rPr>
         <w:t>14.14 · Objective 1 — Salmonella : typhoid and the salmonelloses</w:t>
+      </w:r>
+    </w:p>
+    <w:p>
+      <w:pPr>
+        <w:spacing w:after="120"/>
+      </w:pPr>
+      <w:r>
+        <w:rPr>
+          <w:b w:val="0"/>
+          <w:i/>
+        </w:rPr>
+        <w:t>Salmonella typhi</w:t>
+      </w:r>
+      <w:r>
+        <w:rPr>
+          <w:b w:val="0"/>
+          <w:i w:val="0"/>
+        </w:rPr>
+        <w:t xml:space="preserve"> causes </w:t>
+      </w:r>
+      <w:r>
+        <w:rPr>
+          <w:b/>
+          <w:i w:val="0"/>
+        </w:rPr>
+        <w:t>typhoid fever</w:t>
+      </w:r>
+      <w:r>
+        <w:rPr>
+          <w:b w:val="0"/>
+          <w:i w:val="0"/>
+        </w:rPr>
+        <w:t xml:space="preserve"> and </w:t>
+      </w:r>
+      <w:r>
+        <w:rPr>
+          <w:b w:val="0"/>
+          <w:i/>
+        </w:rPr>
+        <w:t>Salmonella paratyphi</w:t>
+      </w:r>
+      <w:r>
+        <w:rPr>
+          <w:b w:val="0"/>
+          <w:i w:val="0"/>
+        </w:rPr>
+        <w:t xml:space="preserve"> paratyphoid fever, the most serious diseases of the genus.</w:t>
       </w:r>
     </w:p>
     <w:tbl>

</xml_diff>

<commit_message>
WIP: Micro L14 repairs done (3 revise re-audited to pass), Pip cards + Word copy current
Left: full check_all for Microbiology Exam 3, pa-sweep, final commit.

Co-Authored-By: Claude Opus 5.5 <noreply@anthropic.com>
</commit_message>
<xml_diff>
--- a/Microbiology Exam 3/micro-exam-3-study-guide.docx
+++ b/Microbiology Exam 3/micro-exam-3-study-guide.docx
@@ -3032,7 +3032,35 @@
           <w:b w:val="0"/>
           <w:i w:val="0"/>
         </w:rPr>
-        <w:t xml:space="preserve"> The medically important genera fall in three pairs:</w:t>
+        <w:t xml:space="preserve"> (The third branch of the scheme, the </w:t>
+      </w:r>
+      <w:r>
+        <w:rPr>
+          <w:b/>
+          <w:i w:val="0"/>
+        </w:rPr>
+        <w:t>obligate anaerobes</w:t>
+      </w:r>
+      <w:r>
+        <w:rPr>
+          <w:b w:val="0"/>
+          <w:i w:val="0"/>
+        </w:rPr>
+        <w:t xml:space="preserve">, is </w:t>
+      </w:r>
+      <w:r>
+        <w:rPr>
+          <w:b w:val="0"/>
+          <w:i/>
+        </w:rPr>
+        <w:t>Bacteroides</w:t>
+      </w:r>
+      <w:r>
+        <w:rPr>
+          <w:b w:val="0"/>
+          <w:i w:val="0"/>
+        </w:rPr>
+        <w:t>.) The medically important aerobic genera fall in three pairs:</w:t>
       </w:r>
     </w:p>
     <w:tbl>
@@ -6925,73 +6953,92 @@
       </w:pPr>
       <w:r>
         <w:rPr>
+          <w:b w:val="0"/>
+          <w:i w:val="0"/>
+        </w:rPr>
+        <w:t>Why pertussis is rising again.</w:t>
+      </w:r>
+    </w:p>
+    <w:p>
+      <w:pPr>
+        <w:pStyle w:val="ListBullet"/>
+        <w:spacing w:after="40"/>
+      </w:pPr>
+      <w:r>
+        <w:rPr>
           <w:b/>
           <w:i w:val="0"/>
-        </w:rPr>
-        <w:t>Why pertussis is rising again.</w:t>
+          <w:sz w:val="20"/>
+        </w:rPr>
+        <w:t>Infants under 2 months are too young to be vaccinated</w:t>
       </w:r>
       <w:r>
         <w:rPr>
           <w:b w:val="0"/>
           <w:i w:val="0"/>
-        </w:rPr>
-        <w:t xml:space="preserve"> Case charts from 1922 to 2026 show the fall after the whole-cell vaccine and a rise since the acellular vaccine. The deck gives three threads: </w:t>
+          <w:sz w:val="20"/>
+        </w:rPr>
+        <w:t xml:space="preserve"> (they cannot get the vaccine), so incidence is highest under 1 year old (in Florida in 2023, over half of reported cases were not up to date on vaccination).</w:t>
+      </w:r>
+    </w:p>
+    <w:p>
+      <w:pPr>
+        <w:pStyle w:val="ListBullet"/>
+        <w:spacing w:after="40"/>
+      </w:pPr>
+      <w:r>
+        <w:rPr>
+          <w:b w:val="0"/>
+          <w:i w:val="0"/>
+          <w:sz w:val="20"/>
+        </w:rPr>
+        <w:t xml:space="preserve">The age pattern in older children and adolescents </w:t>
       </w:r>
       <w:r>
         <w:rPr>
           <w:b/>
           <w:i w:val="0"/>
-        </w:rPr>
-        <w:t>infants under 2 months are too young to be vaccinated</w:t>
+          <w:sz w:val="20"/>
+        </w:rPr>
+        <w:t>reflects waning immunity from childhood vaccination and the need for booster doses</w:t>
       </w:r>
       <w:r>
         <w:rPr>
           <w:b w:val="0"/>
           <w:i w:val="0"/>
-        </w:rPr>
-        <w:t xml:space="preserve"> (they cannot get the vaccine), so incidence is highest under 1 year old (in Florida in 2023, over half of reported cases were not up to date on vaccination); the age pattern in older children and adolescents </w:t>
+          <w:sz w:val="20"/>
+        </w:rPr>
+        <w:t>.</w:t>
+      </w:r>
+    </w:p>
+    <w:p>
+      <w:pPr>
+        <w:pStyle w:val="ListBullet"/>
+        <w:spacing w:after="40"/>
+      </w:pPr>
+      <w:r>
+        <w:rPr>
+          <w:b w:val="0"/>
+          <w:i w:val="0"/>
+          <w:sz w:val="20"/>
+        </w:rPr>
+        <w:t xml:space="preserve">“Another possible connection”: </w:t>
       </w:r>
       <w:r>
         <w:rPr>
           <w:b/>
           <w:i w:val="0"/>
-        </w:rPr>
-        <w:t>reflects waning immunity from childhood vaccination and the need for booster doses</w:t>
+          <w:sz w:val="20"/>
+        </w:rPr>
+        <w:t>pertactin-negative strains are now developing</w:t>
       </w:r>
       <w:r>
         <w:rPr>
           <w:b w:val="0"/>
           <w:i w:val="0"/>
-        </w:rPr>
-        <w:t xml:space="preserve">; and, “another possible connection”, </w:t>
-      </w:r>
-      <w:r>
-        <w:rPr>
-          <w:b/>
-          <w:i w:val="0"/>
-        </w:rPr>
-        <w:t>pertactin</w:t>
-      </w:r>
-      <w:r>
-        <w:rPr>
-          <w:b w:val="0"/>
-          <w:i w:val="0"/>
-        </w:rPr>
-        <w:t xml:space="preserve">, the protein that helps the bacterium adhere to airway linings and a vaccine component, is missing from </w:t>
-      </w:r>
-      <w:r>
-        <w:rPr>
-          <w:b/>
-          <w:i w:val="0"/>
-        </w:rPr>
-        <w:t>pertactin-negative strains now developing</w:t>
-      </w:r>
-      <w:r>
-        <w:rPr>
-          <w:b w:val="0"/>
-          <w:i w:val="0"/>
-        </w:rPr>
-        <w:t>.</w:t>
+          <w:sz w:val="20"/>
+        </w:rPr>
+        <w:t>. Pertactin is the protein that helps the bacterium adhere to airway linings and a vaccine component, and these strains lack it.</w:t>
       </w:r>
     </w:p>
     <w:p>
@@ -8938,6 +8985,74 @@
       <w:pPr>
         <w:spacing w:after="80"/>
       </w:pPr>
+    </w:p>
+    <w:p>
+      <w:pPr>
+        <w:spacing w:after="120"/>
+      </w:pPr>
+      <w:r>
+        <w:rPr>
+          <w:b w:val="0"/>
+          <w:i w:val="0"/>
+        </w:rPr>
+        <w:t xml:space="preserve">The </w:t>
+      </w:r>
+      <w:r>
+        <w:rPr>
+          <w:b/>
+          <w:i w:val="0"/>
+        </w:rPr>
+        <w:t>true pathogens</w:t>
+      </w:r>
+      <w:r>
+        <w:rPr>
+          <w:b w:val="0"/>
+          <w:i w:val="0"/>
+        </w:rPr>
+        <w:t xml:space="preserve"> are not normal flora: </w:t>
+      </w:r>
+      <w:r>
+        <w:rPr>
+          <w:b w:val="0"/>
+          <w:i/>
+        </w:rPr>
+        <w:t>Salmonella typhi</w:t>
+      </w:r>
+      <w:r>
+        <w:rPr>
+          <w:b w:val="0"/>
+          <w:i w:val="0"/>
+        </w:rPr>
+        <w:t xml:space="preserve"> and the other salmonellae, </w:t>
+      </w:r>
+      <w:r>
+        <w:rPr>
+          <w:b w:val="0"/>
+          <w:i/>
+        </w:rPr>
+        <w:t>Shigella</w:t>
+      </w:r>
+      <w:r>
+        <w:rPr>
+          <w:b w:val="0"/>
+          <w:i w:val="0"/>
+        </w:rPr>
+        <w:t xml:space="preserve"> and the enteric yersinias, and the nonenteric </w:t>
+      </w:r>
+      <w:r>
+        <w:rPr>
+          <w:b w:val="0"/>
+          <w:i/>
+        </w:rPr>
+        <w:t>Yersinia pestis</w:t>
+      </w:r>
+      <w:r>
+        <w:rPr>
+          <w:b w:val="0"/>
+          <w:i w:val="0"/>
+        </w:rPr>
+        <w:t>.</w:t>
+      </w:r>
     </w:p>
     <w:p>
       <w:pPr>
@@ -10526,7 +10641,21 @@
           <w:b w:val="0"/>
           <w:i w:val="0"/>
         </w:rPr>
-        <w:t>, so its colonies come up black.</w:t>
+        <w:t xml:space="preserve">, so its colonies come up black. Enterohemorrhagic infection is managed with dialysis, transfusions and plasmapheresis, and </w:t>
+      </w:r>
+      <w:r>
+        <w:rPr>
+          <w:b/>
+          <w:i w:val="0"/>
+        </w:rPr>
+        <w:t>antibiotic therapy is approached with caution because it may worsen hemolytic uremic syndrome</w:t>
+      </w:r>
+      <w:r>
+        <w:rPr>
+          <w:b w:val="0"/>
+          <w:i w:val="0"/>
+        </w:rPr>
+        <w:t>.</w:t>
       </w:r>
     </w:p>
     <w:p>
@@ -11936,6 +12065,39 @@
     </w:p>
     <w:p>
       <w:pPr>
+        <w:spacing w:after="120"/>
+      </w:pPr>
+      <w:r>
+        <w:rPr>
+          <w:b w:val="0"/>
+          <w:i/>
+        </w:rPr>
+        <w:t>Proteus vulgaris</w:t>
+      </w:r>
+      <w:r>
+        <w:rPr>
+          <w:b w:val="0"/>
+          <w:i w:val="0"/>
+        </w:rPr>
+        <w:t xml:space="preserve"> is diagnosed on the plate by its </w:t>
+      </w:r>
+      <w:r>
+        <w:rPr>
+          <w:b/>
+          <w:i w:val="0"/>
+        </w:rPr>
+        <w:t>wavelike, swarming growth</w:t>
+      </w:r>
+      <w:r>
+        <w:rPr>
+          <w:b w:val="0"/>
+          <w:i w:val="0"/>
+        </w:rPr>
+        <w:t>: highly motile on its peritrichous flagella, it spreads across the agar in waves.</w:t>
+      </w:r>
+    </w:p>
+    <w:p>
+      <w:pPr>
         <w:pStyle w:val="Heading2"/>
         <w:spacing w:before="200" w:after="100"/>
       </w:pPr>
@@ -14506,9 +14668,16 @@
       <w:r>
         <w:rPr>
           <w:b w:val="0"/>
+          <w:i/>
+        </w:rPr>
+        <w:t>Pasteurella multocida</w:t>
+      </w:r>
+      <w:r>
+        <w:rPr>
+          <w:b w:val="0"/>
           <w:i w:val="0"/>
         </w:rPr>
-        <w:t xml:space="preserve">With </w:t>
+        <w:t xml:space="preserve"> is, with </w:t>
       </w:r>
       <w:r>
         <w:rPr>
@@ -14536,7 +14705,7 @@
           <w:b w:val="0"/>
           <w:i w:val="0"/>
         </w:rPr>
-        <w:t xml:space="preserve"> pathogens. A </w:t>
+        <w:t xml:space="preserve"> pathogens: a </w:t>
       </w:r>
       <w:r>
         <w:rPr>
@@ -14550,7 +14719,7 @@
           <w:b w:val="0"/>
           <w:i w:val="0"/>
         </w:rPr>
-        <w:t xml:space="preserve">. Opportunistic infections, mostly in </w:t>
+        <w:t xml:space="preserve">. Its opportunistic infections are mostly in </w:t>
       </w:r>
       <w:r>
         <w:rPr>
@@ -14568,10 +14737,24 @@
       </w:r>
       <w:r>
         <w:rPr>
+          <w:b w:val="0"/>
+          <w:i/>
+        </w:rPr>
+        <w:t>Pasteurella</w:t>
+      </w:r>
+      <w:r>
+        <w:rPr>
+          <w:b w:val="0"/>
+          <w:i w:val="0"/>
+        </w:rPr>
+        <w:t xml:space="preserve"> reaches people through </w:t>
+      </w:r>
+      <w:r>
+        <w:rPr>
           <w:b/>
           <w:i w:val="0"/>
         </w:rPr>
-        <w:t>animal bites or scratches cause a local abscess</w:t>
+        <w:t>animal bites or scratches, which cause a local abscess</w:t>
       </w:r>
       <w:r>
         <w:rPr>

</xml_diff>

<commit_message>
WIP: Micro E3 guide: mucormycosis line in US spelling
Co-Authored-By: Claude Opus 5.5 <noreply@anthropic.com>
</commit_message>
<xml_diff>
--- a/Microbiology Exam 3/micro-exam-3-study-guide.docx
+++ b/Microbiology Exam 3/micro-exam-3-study-guide.docx
@@ -27358,15 +27358,15 @@
           <w:i w:val="0"/>
           <w:sz w:val="20"/>
         </w:rPr>
-        <w:t>“black mould”</w:t>
-      </w:r>
-      <w:r>
-        <w:rPr>
-          <w:b w:val="0"/>
-          <w:i w:val="0"/>
-          <w:sz w:val="20"/>
-        </w:rPr>
-        <w:t xml:space="preserve"> and has arisen as a big concern in </w:t>
+        <w:t>“black mold”</w:t>
+      </w:r>
+      <w:r>
+        <w:rPr>
+          <w:b w:val="0"/>
+          <w:i w:val="0"/>
+          <w:sz w:val="20"/>
+        </w:rPr>
+        <w:t xml:space="preserve"> (the slide spells it mould) and has arisen as a big concern in </w:t>
       </w:r>
       <w:r>
         <w:rPr>

</xml_diff>

<commit_message>
WIP: Micro E3 guide additions re-applied after 15.23 edit, Word guide rebuilt
Co-Authored-By: Claude Opus 5.5 <noreply@anthropic.com>
</commit_message>
<xml_diff>
--- a/Microbiology Exam 3/micro-exam-3-study-guide.docx
+++ b/Microbiology Exam 3/micro-exam-3-study-guide.docx
@@ -28894,7 +28894,7 @@
           <w:i w:val="0"/>
           <w:sz w:val="20"/>
         </w:rPr>
-        <w:t xml:space="preserve"> Slide 63 calls mucormycosis “black mould”; slide 65 calls </w:t>
+        <w:t xml:space="preserve"> Slide 63 calls mucormycosis “black mold” (in British spelling); slide 65 calls </w:t>
       </w:r>
       <w:r>
         <w:rPr>
@@ -28964,7 +28964,7 @@
           <w:i w:val="0"/>
           <w:sz w:val="20"/>
         </w:rPr>
-        <w:t>, as slide 33 spells it; “mould” is written mold here.</w:t>
+        <w:t>, as slide 33 spells it; the deck’s British spellings are written in US spelling here.</w:t>
       </w:r>
     </w:p>
     <w:p>

</xml_diff>